<commit_message>
drop 'Omni-Channel' from report/readme titles and headings; regenerate docx (term kept only inside the verbatim Build Code prompt quote)
</commit_message>
<xml_diff>
--- a/docs/capstone-report.docx
+++ b/docs/capstone-report.docx
@@ -28,13 +28,13 @@
         </w:p>
       </w:sdtContent>
     </w:sdt>
-    <w:bookmarkStart w:id="23" w:name="X389c3029e8fecc67dc128a2861e3afb810a4b6f"/>
+    <w:bookmarkStart w:id="23" w:name="X24d1aaecfb3563f140287aebfd4de275142ec9d"/>
     <w:p>
       <w:pPr>
         <w:pStyle w:val="Heading1"/>
       </w:pPr>
       <w:r>
-        <w:t xml:space="preserve">Retail Omni-Channel Customer Loyalty &amp; Rewards Management System</w:t>
+        <w:t xml:space="preserve">Retail Customer Loyalty &amp; Rewards Management System</w:t>
       </w:r>
     </w:p>
     <w:p>
@@ -561,13 +561,13 @@
       </w:r>
     </w:p>
     <w:bookmarkEnd w:id="24"/>
-    <w:bookmarkStart w:id="25" w:name="X3e96fdd9040c1e923c0b9cc444f0a5b5c7fd7c3"/>
+    <w:bookmarkStart w:id="25" w:name="X69892e736b867031ed964f7929db5b5649aef6d"/>
     <w:p>
       <w:pPr>
         <w:pStyle w:val="Heading2"/>
       </w:pPr>
       <w:r>
-        <w:t xml:space="preserve">1.2 Background — why omni-channel loyalty is a real problem</w:t>
+        <w:t xml:space="preserve">1.2 Background — why cross-channel loyalty is a real problem</w:t>
       </w:r>
     </w:p>
     <w:p>

</xml_diff>